<commit_message>
feito MER, 3FN, modelo descritivo, logical
</commit_message>
<xml_diff>
--- a/documentaçãoDB.docx
+++ b/documentaçãoDB.docx
@@ -1509,7 +1509,6 @@
         </w:rPr>
       </w:pPr>
       <w:bookmarkStart w:id="0" w:name="_Toc197931762"/>
-      <w:bookmarkStart w:id="1" w:name="_GoBack"/>
       <w:r>
         <w:rPr>
           <w:rFonts w:cs="Times New Roman"/>
@@ -1518,7 +1517,6 @@
         <w:br w:type="page"/>
       </w:r>
     </w:p>
-    <w:bookmarkEnd w:id="1"/>
     <w:p>
       <w:pPr>
         <w:pStyle w:val="Ttulo1"/>
@@ -1549,99 +1547,99 @@
       <w:pPr>
         <w:pStyle w:val="Ttulo2"/>
       </w:pPr>
-      <w:bookmarkStart w:id="2" w:name="_Toc197931763"/>
+      <w:bookmarkStart w:id="1" w:name="_Toc197931763"/>
       <w:r>
         <w:t>Objetivo da Solução</w:t>
       </w:r>
+      <w:bookmarkEnd w:id="1"/>
+    </w:p>
+    <w:p>
+      <w:pPr>
+        <w:pStyle w:val="NormalWeb"/>
+      </w:pPr>
+      <w:bookmarkStart w:id="2" w:name="_Toc197931764"/>
+      <w:r>
+        <w:t xml:space="preserve">O banco de dados do projeto </w:t>
+      </w:r>
+      <w:proofErr w:type="spellStart"/>
+      <w:r>
+        <w:t>Clyvo</w:t>
+      </w:r>
+      <w:proofErr w:type="spellEnd"/>
+      <w:r>
+        <w:t xml:space="preserve"> </w:t>
+      </w:r>
+      <w:proofErr w:type="spellStart"/>
+      <w:r>
+        <w:t>Vet</w:t>
+      </w:r>
+      <w:proofErr w:type="spellEnd"/>
+      <w:r>
+        <w:t xml:space="preserve"> tem como objetivo armazenar e organizar as informações necessárias para o acompanhamento preventivo da saúde de pets.</w:t>
+      </w:r>
+    </w:p>
+    <w:p>
+      <w:pPr>
+        <w:pStyle w:val="NormalWeb"/>
+      </w:pPr>
+      <w:r>
+        <w:t xml:space="preserve">A estrutura foi criada para permitir o cadastro de tutores, pets, histórico clínico, dispositivos </w:t>
+      </w:r>
+      <w:proofErr w:type="spellStart"/>
+      <w:r>
+        <w:t>IoT</w:t>
+      </w:r>
+      <w:proofErr w:type="spellEnd"/>
+      <w:r>
+        <w:t xml:space="preserve"> e alertas inteligentes. Com esses dados, o sistema poderá apoiar a continuidade do cuidado veterinário, registrando informações importantes do animal e permitindo a geração de alertas preventivos com base em dados clínicos e dados coletados por dispositivos.</w:t>
+      </w:r>
+    </w:p>
+    <w:p>
+      <w:pPr>
+        <w:pStyle w:val="NormalWeb"/>
+      </w:pPr>
+      <w:r>
+        <w:t>O modelo foi pensado para o escopo inicial do MVP, mantendo uma estrutura simples, relacional e coerente com a proposta do projeto.</w:t>
+      </w:r>
+    </w:p>
+    <w:p>
+      <w:pPr>
+        <w:pStyle w:val="Ttulo2"/>
+      </w:pPr>
+      <w:r>
+        <w:t>Justificativa da Escolha do Tema</w:t>
+      </w:r>
       <w:bookmarkEnd w:id="2"/>
     </w:p>
     <w:p>
       <w:pPr>
-        <w:pStyle w:val="NormalWeb"/>
-      </w:pPr>
-      <w:bookmarkStart w:id="3" w:name="_Toc197931764"/>
-      <w:r>
-        <w:t xml:space="preserve">O banco de dados do projeto </w:t>
-      </w:r>
-      <w:proofErr w:type="spellStart"/>
-      <w:r>
-        <w:t>Clyvo</w:t>
-      </w:r>
-      <w:proofErr w:type="spellEnd"/>
-      <w:r>
-        <w:t xml:space="preserve"> </w:t>
-      </w:r>
-      <w:proofErr w:type="spellStart"/>
-      <w:r>
-        <w:t>Vet</w:t>
-      </w:r>
-      <w:proofErr w:type="spellEnd"/>
-      <w:r>
-        <w:t xml:space="preserve"> tem como objetivo armazenar e organizar as informações necessárias para o acompanhamento preventivo da saúde de pets.</w:t>
-      </w:r>
-    </w:p>
-    <w:p>
-      <w:pPr>
-        <w:pStyle w:val="NormalWeb"/>
-      </w:pPr>
-      <w:r>
-        <w:t xml:space="preserve">A estrutura foi criada para permitir o cadastro de tutores, pets, histórico clínico, dispositivos </w:t>
-      </w:r>
-      <w:proofErr w:type="spellStart"/>
-      <w:r>
-        <w:t>IoT</w:t>
-      </w:r>
-      <w:proofErr w:type="spellEnd"/>
-      <w:r>
-        <w:t xml:space="preserve"> e alertas inteligentes. Com esses dados, o sistema poderá apoiar a continuidade do cuidado veterinário, registrando informações importantes do animal e permitindo a geração de alertas preventivos com base em dados clínicos e dados coletados por dispositivos.</w:t>
-      </w:r>
-    </w:p>
-    <w:p>
-      <w:pPr>
-        <w:pStyle w:val="NormalWeb"/>
-      </w:pPr>
-      <w:r>
-        <w:t>O modelo foi pensado para o escopo inicial do MVP, mantendo uma estrutura simples, relacional e coerente com a proposta do projeto.</w:t>
+        <w:ind w:firstLine="576"/>
+        <w:rPr>
+          <w:rFonts w:ascii="Times New Roman" w:hAnsi="Times New Roman" w:cs="Times New Roman"/>
+        </w:rPr>
+      </w:pPr>
+      <w:r>
+        <w:rPr>
+          <w:rFonts w:ascii="Times New Roman" w:hAnsi="Times New Roman" w:cs="Times New Roman"/>
+        </w:rPr>
+        <w:t>Porque essa solução é relevante e como ela se relaciona ao desafio da Sprint</w:t>
+      </w:r>
+      <w:r>
+        <w:rPr>
+          <w:rFonts w:ascii="Times New Roman" w:hAnsi="Times New Roman" w:cs="Times New Roman"/>
+        </w:rPr>
+        <w:t xml:space="preserve"> (no mínimo 10 linhas).</w:t>
       </w:r>
     </w:p>
     <w:p>
       <w:pPr>
         <w:pStyle w:val="Ttulo2"/>
       </w:pPr>
-      <w:r>
-        <w:t>Justificativa da Escolha do Tema</w:t>
+      <w:bookmarkStart w:id="3" w:name="_Toc197931765"/>
+      <w:r>
+        <w:t>Tecnologias Utilizadas</w:t>
       </w:r>
       <w:bookmarkEnd w:id="3"/>
-    </w:p>
-    <w:p>
-      <w:pPr>
-        <w:ind w:firstLine="576"/>
-        <w:rPr>
-          <w:rFonts w:ascii="Times New Roman" w:hAnsi="Times New Roman" w:cs="Times New Roman"/>
-        </w:rPr>
-      </w:pPr>
-      <w:r>
-        <w:rPr>
-          <w:rFonts w:ascii="Times New Roman" w:hAnsi="Times New Roman" w:cs="Times New Roman"/>
-        </w:rPr>
-        <w:t>Porque essa solução é relevante e como ela se relaciona ao desafio da Sprint</w:t>
-      </w:r>
-      <w:r>
-        <w:rPr>
-          <w:rFonts w:ascii="Times New Roman" w:hAnsi="Times New Roman" w:cs="Times New Roman"/>
-        </w:rPr>
-        <w:t xml:space="preserve"> (no mínimo 10 linhas).</w:t>
-      </w:r>
-    </w:p>
-    <w:p>
-      <w:pPr>
-        <w:pStyle w:val="Ttulo2"/>
-      </w:pPr>
-      <w:bookmarkStart w:id="4" w:name="_Toc197931765"/>
-      <w:r>
-        <w:t>Tecnologias Utilizadas</w:t>
-      </w:r>
-      <w:bookmarkEnd w:id="4"/>
     </w:p>
     <w:p>
       <w:pPr>
@@ -1701,7 +1699,7 @@
           <w:szCs w:val="28"/>
         </w:rPr>
       </w:pPr>
-      <w:bookmarkStart w:id="5" w:name="_Toc197931766"/>
+      <w:bookmarkStart w:id="4" w:name="_Toc197931766"/>
       <w:r>
         <w:rPr>
           <w:sz w:val="28"/>
@@ -1710,7 +1708,7 @@
         <w:lastRenderedPageBreak/>
         <w:t>DOCUMENTAÇÃO POR DISCIPLINA</w:t>
       </w:r>
-      <w:bookmarkEnd w:id="5"/>
+      <w:bookmarkEnd w:id="4"/>
     </w:p>
     <w:p>
       <w:pPr>
@@ -1806,7 +1804,297 @@
           <w:b/>
           <w:bCs/>
         </w:rPr>
-        <w:t>2.2 Modelagem Conceitual</w:t>
+        <w:t xml:space="preserve">2.2 Modelagem </w:t>
+      </w:r>
+      <w:r>
+        <w:rPr>
+          <w:rFonts w:ascii="Times New Roman" w:hAnsi="Times New Roman" w:cs="Times New Roman"/>
+          <w:b/>
+          <w:bCs/>
+        </w:rPr>
+        <w:t>descritiva</w:t>
+      </w:r>
+    </w:p>
+    <w:p>
+      <w:pPr>
+        <w:rPr>
+          <w:rFonts w:ascii="Times New Roman" w:hAnsi="Times New Roman" w:cs="Times New Roman"/>
+        </w:rPr>
+      </w:pPr>
+      <w:r>
+        <w:rPr>
+          <w:rFonts w:ascii="Times New Roman" w:hAnsi="Times New Roman" w:cs="Times New Roman"/>
+        </w:rPr>
+        <w:t>T_CLY_USUARIO</w:t>
+      </w:r>
+    </w:p>
+    <w:p>
+      <w:pPr>
+        <w:rPr>
+          <w:rFonts w:ascii="Times New Roman" w:hAnsi="Times New Roman" w:cs="Times New Roman"/>
+        </w:rPr>
+      </w:pPr>
+      <w:r>
+        <w:rPr>
+          <w:rFonts w:ascii="Times New Roman" w:hAnsi="Times New Roman" w:cs="Times New Roman"/>
+        </w:rPr>
+        <w:t>Armazena os dados do tutor/responsável pelo pet.</w:t>
+      </w:r>
+    </w:p>
+    <w:p>
+      <w:pPr>
+        <w:rPr>
+          <w:rFonts w:ascii="Times New Roman" w:hAnsi="Times New Roman" w:cs="Times New Roman"/>
+        </w:rPr>
+      </w:pPr>
+    </w:p>
+    <w:p>
+      <w:pPr>
+        <w:rPr>
+          <w:rFonts w:ascii="Times New Roman" w:hAnsi="Times New Roman" w:cs="Times New Roman"/>
+        </w:rPr>
+      </w:pPr>
+      <w:r>
+        <w:rPr>
+          <w:rFonts w:ascii="Times New Roman" w:hAnsi="Times New Roman" w:cs="Times New Roman"/>
+        </w:rPr>
+        <w:t>T_CLY_PET</w:t>
+      </w:r>
+    </w:p>
+    <w:p>
+      <w:pPr>
+        <w:rPr>
+          <w:rFonts w:ascii="Times New Roman" w:hAnsi="Times New Roman" w:cs="Times New Roman"/>
+        </w:rPr>
+      </w:pPr>
+      <w:r>
+        <w:rPr>
+          <w:rFonts w:ascii="Times New Roman" w:hAnsi="Times New Roman" w:cs="Times New Roman"/>
+        </w:rPr>
+        <w:t>Armazena os dados cadastrais do pet e se relaciona com o tutor.</w:t>
+      </w:r>
+    </w:p>
+    <w:p>
+      <w:pPr>
+        <w:rPr>
+          <w:rFonts w:ascii="Times New Roman" w:hAnsi="Times New Roman" w:cs="Times New Roman"/>
+        </w:rPr>
+      </w:pPr>
+    </w:p>
+    <w:p>
+      <w:pPr>
+        <w:rPr>
+          <w:rFonts w:ascii="Times New Roman" w:hAnsi="Times New Roman" w:cs="Times New Roman"/>
+        </w:rPr>
+      </w:pPr>
+      <w:r>
+        <w:rPr>
+          <w:rFonts w:ascii="Times New Roman" w:hAnsi="Times New Roman" w:cs="Times New Roman"/>
+        </w:rPr>
+        <w:t>T_CLY_HISTORICO_CLINICO</w:t>
+      </w:r>
+    </w:p>
+    <w:p>
+      <w:pPr>
+        <w:rPr>
+          <w:rFonts w:ascii="Times New Roman" w:hAnsi="Times New Roman" w:cs="Times New Roman"/>
+        </w:rPr>
+      </w:pPr>
+      <w:r>
+        <w:rPr>
+          <w:rFonts w:ascii="Times New Roman" w:hAnsi="Times New Roman" w:cs="Times New Roman"/>
+        </w:rPr>
+        <w:t>Armazena registros como vacinas, consultas, doenças, medicamentos, observações e exames.</w:t>
+      </w:r>
+    </w:p>
+    <w:p>
+      <w:pPr>
+        <w:rPr>
+          <w:rFonts w:ascii="Times New Roman" w:hAnsi="Times New Roman" w:cs="Times New Roman"/>
+        </w:rPr>
+      </w:pPr>
+    </w:p>
+    <w:p>
+      <w:pPr>
+        <w:rPr>
+          <w:rFonts w:ascii="Times New Roman" w:hAnsi="Times New Roman" w:cs="Times New Roman"/>
+        </w:rPr>
+      </w:pPr>
+      <w:r>
+        <w:rPr>
+          <w:rFonts w:ascii="Times New Roman" w:hAnsi="Times New Roman" w:cs="Times New Roman"/>
+        </w:rPr>
+        <w:t>T_CLY_DISPOSITIVO_IOT</w:t>
+      </w:r>
+    </w:p>
+    <w:p>
+      <w:pPr>
+        <w:rPr>
+          <w:rFonts w:ascii="Times New Roman" w:hAnsi="Times New Roman" w:cs="Times New Roman"/>
+        </w:rPr>
+      </w:pPr>
+      <w:r>
+        <w:rPr>
+          <w:rFonts w:ascii="Times New Roman" w:hAnsi="Times New Roman" w:cs="Times New Roman"/>
+        </w:rPr>
+        <w:t>Armazena o dispositivo vinculado ao pet e a leitura atual consolidada.</w:t>
+      </w:r>
+    </w:p>
+    <w:p>
+      <w:pPr>
+        <w:rPr>
+          <w:rFonts w:ascii="Times New Roman" w:hAnsi="Times New Roman" w:cs="Times New Roman"/>
+        </w:rPr>
+      </w:pPr>
+    </w:p>
+    <w:p>
+      <w:pPr>
+        <w:rPr>
+          <w:rFonts w:ascii="Times New Roman" w:hAnsi="Times New Roman" w:cs="Times New Roman"/>
+        </w:rPr>
+      </w:pPr>
+      <w:r>
+        <w:rPr>
+          <w:rFonts w:ascii="Times New Roman" w:hAnsi="Times New Roman" w:cs="Times New Roman"/>
+        </w:rPr>
+        <w:t>T_CLY_ALERTA_INTELIGENTE</w:t>
+      </w:r>
+    </w:p>
+    <w:p>
+      <w:pPr>
+        <w:rPr>
+          <w:rFonts w:ascii="Times New Roman" w:hAnsi="Times New Roman" w:cs="Times New Roman"/>
+          <w:b/>
+          <w:bCs/>
+        </w:rPr>
+      </w:pPr>
+      <w:r>
+        <w:rPr>
+          <w:rFonts w:ascii="Times New Roman" w:hAnsi="Times New Roman" w:cs="Times New Roman"/>
+        </w:rPr>
+        <w:t>Armazena os alertas gerados pelo sistema.</w:t>
+      </w:r>
+      <w:r>
+        <w:rPr>
+          <w:rFonts w:ascii="Times New Roman" w:hAnsi="Times New Roman" w:cs="Times New Roman"/>
+          <w:b/>
+          <w:bCs/>
+        </w:rPr>
+        <w:t xml:space="preserve"> </w:t>
+      </w:r>
+    </w:p>
+    <w:p>
+      <w:pPr>
+        <w:rPr>
+          <w:rFonts w:ascii="Times New Roman" w:hAnsi="Times New Roman" w:cs="Times New Roman"/>
+          <w:b/>
+          <w:bCs/>
+        </w:rPr>
+      </w:pPr>
+    </w:p>
+    <w:p>
+      <w:pPr>
+        <w:rPr>
+          <w:rFonts w:ascii="Times New Roman" w:hAnsi="Times New Roman" w:cs="Times New Roman"/>
+          <w:b/>
+          <w:bCs/>
+        </w:rPr>
+      </w:pPr>
+    </w:p>
+    <w:p>
+      <w:pPr>
+        <w:rPr>
+          <w:rFonts w:ascii="Times New Roman" w:hAnsi="Times New Roman" w:cs="Times New Roman"/>
+          <w:b/>
+          <w:bCs/>
+        </w:rPr>
+      </w:pPr>
+    </w:p>
+    <w:p>
+      <w:pPr>
+        <w:rPr>
+          <w:rFonts w:ascii="Times New Roman" w:hAnsi="Times New Roman" w:cs="Times New Roman"/>
+          <w:b/>
+          <w:bCs/>
+        </w:rPr>
+      </w:pPr>
+    </w:p>
+    <w:p>
+      <w:pPr>
+        <w:rPr>
+          <w:rFonts w:ascii="Times New Roman" w:hAnsi="Times New Roman" w:cs="Times New Roman"/>
+          <w:b/>
+          <w:bCs/>
+        </w:rPr>
+      </w:pPr>
+    </w:p>
+    <w:p>
+      <w:pPr>
+        <w:rPr>
+          <w:rFonts w:ascii="Times New Roman" w:hAnsi="Times New Roman" w:cs="Times New Roman"/>
+          <w:b/>
+          <w:bCs/>
+        </w:rPr>
+      </w:pPr>
+      <w:r>
+        <w:rPr>
+          <w:rFonts w:ascii="Times New Roman" w:hAnsi="Times New Roman" w:cs="Times New Roman"/>
+          <w:b/>
+          <w:bCs/>
+        </w:rPr>
+        <w:lastRenderedPageBreak/>
+        <w:t xml:space="preserve">2.3 Modelagem Lógica (ou </w:t>
+      </w:r>
+      <w:proofErr w:type="spellStart"/>
+      <w:r>
+        <w:rPr>
+          <w:rFonts w:ascii="Times New Roman" w:hAnsi="Times New Roman" w:cs="Times New Roman"/>
+          <w:b/>
+          <w:bCs/>
+        </w:rPr>
+        <w:t>Relational</w:t>
+      </w:r>
+      <w:proofErr w:type="spellEnd"/>
+      <w:r>
+        <w:rPr>
+          <w:rFonts w:ascii="Times New Roman" w:hAnsi="Times New Roman" w:cs="Times New Roman"/>
+          <w:b/>
+          <w:bCs/>
+        </w:rPr>
+        <w:t>)</w:t>
+      </w:r>
+    </w:p>
+    <w:p>
+      <w:pPr>
+        <w:jc w:val="both"/>
+        <w:rPr>
+          <w:rFonts w:ascii="Times New Roman" w:hAnsi="Times New Roman" w:cs="Times New Roman"/>
+        </w:rPr>
+      </w:pPr>
+      <w:r>
+        <w:rPr>
+          <w:rFonts w:ascii="Times New Roman" w:hAnsi="Times New Roman" w:cs="Times New Roman"/>
+        </w:rPr>
+        <w:tab/>
+        <w:t>É a expansão da Modelagem Conceitual, onde a sua representação é um diagrama</w:t>
+      </w:r>
+      <w:r>
+        <w:rPr>
+          <w:rFonts w:ascii="Times New Roman" w:hAnsi="Times New Roman" w:cs="Times New Roman"/>
+        </w:rPr>
+        <w:t xml:space="preserve"> com a definição dos tipos de dados para cada atributo, a definição de chave estrangeiras, primárias </w:t>
+      </w:r>
+      <w:r>
+        <w:rPr>
+          <w:rFonts w:ascii="Times New Roman" w:hAnsi="Times New Roman" w:cs="Times New Roman"/>
+        </w:rPr>
+        <w:t>e a normalização</w:t>
+      </w:r>
+      <w:r>
+        <w:rPr>
+          <w:rFonts w:ascii="Times New Roman" w:hAnsi="Times New Roman" w:cs="Times New Roman"/>
+        </w:rPr>
+        <w:t>.</w:t>
       </w:r>
     </w:p>
     <w:p>
@@ -1821,31 +2109,31 @@
         <w:rPr>
           <w:rFonts w:ascii="Times New Roman" w:hAnsi="Times New Roman" w:cs="Times New Roman"/>
         </w:rPr>
-        <w:t>É o modelo Entidade-Relacionamento (MER)</w:t>
-      </w:r>
-      <w:r>
-        <w:rPr>
-          <w:rFonts w:ascii="Times New Roman" w:hAnsi="Times New Roman" w:cs="Times New Roman"/>
-        </w:rPr>
-        <w:t>,</w:t>
-      </w:r>
-      <w:r>
-        <w:rPr>
-          <w:rFonts w:ascii="Times New Roman" w:hAnsi="Times New Roman" w:cs="Times New Roman"/>
-        </w:rPr>
-        <w:t xml:space="preserve"> a representação visual do banco de dados com entidades, atributos e relacionamentos</w:t>
+        <w:t>Nesse subcapitulo é esperado uma imagem legível e de alta qualidade sobre o M</w:t>
+      </w:r>
+      <w:r>
+        <w:rPr>
+          <w:rFonts w:ascii="Times New Roman" w:hAnsi="Times New Roman" w:cs="Times New Roman"/>
+        </w:rPr>
+        <w:t>odelagem Lógica</w:t>
+      </w:r>
+      <w:r>
+        <w:rPr>
+          <w:rFonts w:ascii="Times New Roman" w:hAnsi="Times New Roman" w:cs="Times New Roman"/>
+        </w:rPr>
+        <w:t xml:space="preserve"> relacionado ao seu </w:t>
+      </w:r>
+      <w:r>
+        <w:rPr>
+          <w:rFonts w:ascii="Times New Roman" w:hAnsi="Times New Roman" w:cs="Times New Roman"/>
+        </w:rPr>
+        <w:t>projeto</w:t>
       </w:r>
       <w:r>
         <w:rPr>
           <w:rFonts w:ascii="Times New Roman" w:hAnsi="Times New Roman" w:cs="Times New Roman"/>
         </w:rPr>
         <w:t>.</w:t>
-      </w:r>
-      <w:r>
-        <w:rPr>
-          <w:rFonts w:ascii="Times New Roman" w:hAnsi="Times New Roman" w:cs="Times New Roman"/>
-        </w:rPr>
-        <w:t xml:space="preserve"> É esperado de forma mínima 5 entidades com 3 atributos para cada.</w:t>
       </w:r>
     </w:p>
     <w:p>
@@ -1860,44 +2148,16 @@
         <w:rPr>
           <w:rFonts w:ascii="Times New Roman" w:hAnsi="Times New Roman" w:cs="Times New Roman"/>
         </w:rPr>
-        <w:t xml:space="preserve">Nesse subcapitulo </w:t>
-      </w:r>
-      <w:r>
-        <w:rPr>
-          <w:rFonts w:ascii="Times New Roman" w:hAnsi="Times New Roman" w:cs="Times New Roman"/>
-        </w:rPr>
-        <w:t xml:space="preserve">é esperado </w:t>
-      </w:r>
-      <w:r>
-        <w:rPr>
-          <w:rFonts w:ascii="Times New Roman" w:hAnsi="Times New Roman" w:cs="Times New Roman"/>
-        </w:rPr>
-        <w:t xml:space="preserve">uma imagem </w:t>
-      </w:r>
-      <w:r>
-        <w:rPr>
-          <w:rFonts w:ascii="Times New Roman" w:hAnsi="Times New Roman" w:cs="Times New Roman"/>
-        </w:rPr>
-        <w:t xml:space="preserve">legível e </w:t>
-      </w:r>
-      <w:r>
-        <w:rPr>
-          <w:rFonts w:ascii="Times New Roman" w:hAnsi="Times New Roman" w:cs="Times New Roman"/>
-        </w:rPr>
-        <w:t>de alta qualidade sobre</w:t>
-      </w:r>
-      <w:r>
-        <w:rPr>
-          <w:rFonts w:ascii="Times New Roman" w:hAnsi="Times New Roman" w:cs="Times New Roman"/>
-        </w:rPr>
-        <w:t xml:space="preserve"> o MER relacionado ao seu </w:t>
-      </w:r>
-      <w:r>
-        <w:rPr>
-          <w:rFonts w:ascii="Times New Roman" w:hAnsi="Times New Roman" w:cs="Times New Roman"/>
-        </w:rPr>
-        <w:t>projeto</w:t>
-      </w:r>
+        <w:t xml:space="preserve">Utilize os softwares de modelagem aplicados na aula, por exemplo, ORACLE DATA MODELER ou </w:t>
+      </w:r>
+      <w:proofErr w:type="spellStart"/>
+      <w:r>
+        <w:rPr>
+          <w:rFonts w:ascii="Times New Roman" w:hAnsi="Times New Roman" w:cs="Times New Roman"/>
+        </w:rPr>
+        <w:t>BrModelo</w:t>
+      </w:r>
+      <w:proofErr w:type="spellEnd"/>
       <w:r>
         <w:rPr>
           <w:rFonts w:ascii="Times New Roman" w:hAnsi="Times New Roman" w:cs="Times New Roman"/>
@@ -1913,170 +2173,829 @@
           <w:rFonts w:ascii="Times New Roman" w:hAnsi="Times New Roman" w:cs="Times New Roman"/>
         </w:rPr>
       </w:pPr>
-      <w:r>
-        <w:rPr>
-          <w:rFonts w:ascii="Times New Roman" w:hAnsi="Times New Roman" w:cs="Times New Roman"/>
-        </w:rPr>
-        <w:t xml:space="preserve">Utilize os softwares de modelagem aplicados na aula, por exemplo, ORACLE DATA MODELER ou </w:t>
-      </w:r>
+    </w:p>
+    <w:p>
+      <w:pPr>
+        <w:rPr>
+          <w:rFonts w:ascii="Times New Roman" w:hAnsi="Times New Roman" w:cs="Times New Roman"/>
+          <w:b/>
+          <w:bCs/>
+        </w:rPr>
+      </w:pPr>
+      <w:r>
+        <w:rPr>
+          <w:rFonts w:ascii="Times New Roman" w:hAnsi="Times New Roman" w:cs="Times New Roman"/>
+          <w:b/>
+          <w:bCs/>
+        </w:rPr>
+        <w:t>2.4</w:t>
+      </w:r>
+      <w:r>
+        <w:rPr>
+          <w:rFonts w:ascii="Times New Roman" w:hAnsi="Times New Roman" w:cs="Times New Roman"/>
+          <w:b/>
+          <w:bCs/>
+        </w:rPr>
+        <w:t xml:space="preserve"> </w:t>
+      </w:r>
+      <w:r>
+        <w:rPr>
+          <w:rFonts w:ascii="Times New Roman" w:hAnsi="Times New Roman" w:cs="Times New Roman"/>
+          <w:b/>
+          <w:bCs/>
+        </w:rPr>
+        <w:t>3FN</w:t>
+      </w:r>
+    </w:p>
+    <w:p>
+      <w:pPr>
+        <w:pStyle w:val="NormalWeb"/>
+      </w:pPr>
+      <w:r>
+        <w:t xml:space="preserve">O modelo foi estruturado para atender à </w:t>
+      </w:r>
+      <w:r>
+        <w:rPr>
+          <w:rStyle w:val="Forte"/>
+          <w:rFonts w:eastAsiaTheme="majorEastAsia"/>
+        </w:rPr>
+        <w:t>Terceira Forma Normal</w:t>
+      </w:r>
+      <w:r>
+        <w:t>, conforme exigido na disciplina de banco.</w:t>
+      </w:r>
+    </w:p>
+    <w:p/>
+    <w:p>
+      <w:pPr>
+        <w:pStyle w:val="Ttulo2"/>
+        <w:numPr>
+          <w:ilvl w:val="0"/>
+          <w:numId w:val="0"/>
+        </w:numPr>
+        <w:ind w:left="576" w:hanging="576"/>
+      </w:pPr>
+      <w:r>
+        <w:t>Primeira Forma Normal — 1FN</w:t>
+      </w:r>
+    </w:p>
+    <w:p>
+      <w:pPr>
+        <w:pStyle w:val="NormalWeb"/>
+      </w:pPr>
+      <w:r>
+        <w:t>O modelo atende à 1FN porque todos os atributos armazenam valores atômicos, ou seja, cada campo guarda apenas uma informação por registro.</w:t>
+      </w:r>
+    </w:p>
+    <w:p>
+      <w:pPr>
+        <w:pStyle w:val="NormalWeb"/>
+      </w:pPr>
+      <w:r>
+        <w:t>Exemplos:</w:t>
+      </w:r>
+    </w:p>
+    <w:p>
+      <w:pPr>
+        <w:numPr>
+          <w:ilvl w:val="0"/>
+          <w:numId w:val="6"/>
+        </w:numPr>
+        <w:spacing w:before="100" w:beforeAutospacing="1" w:after="100" w:afterAutospacing="1" w:line="240" w:lineRule="auto"/>
+      </w:pPr>
+      <w:proofErr w:type="gramStart"/>
+      <w:r>
+        <w:rPr>
+          <w:rStyle w:val="CdigoHTML"/>
+          <w:rFonts w:eastAsiaTheme="majorEastAsia"/>
+        </w:rPr>
+        <w:t>nome</w:t>
+      </w:r>
+      <w:proofErr w:type="gramEnd"/>
+      <w:r>
+        <w:t xml:space="preserve"> armazena apenas o nome. </w:t>
+      </w:r>
+    </w:p>
+    <w:p>
+      <w:pPr>
+        <w:numPr>
+          <w:ilvl w:val="0"/>
+          <w:numId w:val="6"/>
+        </w:numPr>
+        <w:spacing w:before="100" w:beforeAutospacing="1" w:after="100" w:afterAutospacing="1" w:line="240" w:lineRule="auto"/>
+      </w:pPr>
       <w:proofErr w:type="spellStart"/>
-      <w:r>
-        <w:rPr>
-          <w:rFonts w:ascii="Times New Roman" w:hAnsi="Times New Roman" w:cs="Times New Roman"/>
-        </w:rPr>
-        <w:t>BrModelo</w:t>
+      <w:proofErr w:type="gramStart"/>
+      <w:r>
+        <w:rPr>
+          <w:rStyle w:val="CdigoHTML"/>
+          <w:rFonts w:eastAsiaTheme="majorEastAsia"/>
+        </w:rPr>
+        <w:t>cpf</w:t>
       </w:r>
       <w:proofErr w:type="spellEnd"/>
-      <w:r>
-        <w:rPr>
-          <w:rFonts w:ascii="Times New Roman" w:hAnsi="Times New Roman" w:cs="Times New Roman"/>
-        </w:rPr>
+      <w:proofErr w:type="gramEnd"/>
+      <w:r>
+        <w:t xml:space="preserve"> armazena apenas o CPF. </w:t>
+      </w:r>
+    </w:p>
+    <w:p>
+      <w:pPr>
+        <w:numPr>
+          <w:ilvl w:val="0"/>
+          <w:numId w:val="6"/>
+        </w:numPr>
+        <w:spacing w:before="100" w:beforeAutospacing="1" w:after="100" w:afterAutospacing="1" w:line="240" w:lineRule="auto"/>
+      </w:pPr>
+      <w:proofErr w:type="spellStart"/>
+      <w:proofErr w:type="gramStart"/>
+      <w:r>
+        <w:rPr>
+          <w:rStyle w:val="CdigoHTML"/>
+          <w:rFonts w:eastAsiaTheme="majorEastAsia"/>
+        </w:rPr>
+        <w:t>email</w:t>
+      </w:r>
+      <w:proofErr w:type="spellEnd"/>
+      <w:proofErr w:type="gramEnd"/>
+      <w:r>
+        <w:t xml:space="preserve"> armazena apenas o e-mail. </w:t>
+      </w:r>
+    </w:p>
+    <w:p>
+      <w:pPr>
+        <w:numPr>
+          <w:ilvl w:val="0"/>
+          <w:numId w:val="6"/>
+        </w:numPr>
+        <w:spacing w:before="100" w:beforeAutospacing="1" w:after="100" w:afterAutospacing="1" w:line="240" w:lineRule="auto"/>
+      </w:pPr>
+      <w:proofErr w:type="spellStart"/>
+      <w:proofErr w:type="gramStart"/>
+      <w:r>
+        <w:rPr>
+          <w:rStyle w:val="CdigoHTML"/>
+          <w:rFonts w:eastAsiaTheme="majorEastAsia"/>
+        </w:rPr>
+        <w:t>especie</w:t>
+      </w:r>
+      <w:proofErr w:type="spellEnd"/>
+      <w:proofErr w:type="gramEnd"/>
+      <w:r>
+        <w:t xml:space="preserve"> armazena apenas a espécie. </w:t>
+      </w:r>
+    </w:p>
+    <w:p>
+      <w:pPr>
+        <w:numPr>
+          <w:ilvl w:val="0"/>
+          <w:numId w:val="6"/>
+        </w:numPr>
+        <w:spacing w:before="100" w:beforeAutospacing="1" w:after="100" w:afterAutospacing="1" w:line="240" w:lineRule="auto"/>
+      </w:pPr>
+      <w:proofErr w:type="spellStart"/>
+      <w:proofErr w:type="gramStart"/>
+      <w:r>
+        <w:rPr>
+          <w:rStyle w:val="CdigoHTML"/>
+          <w:rFonts w:eastAsiaTheme="majorEastAsia"/>
+        </w:rPr>
+        <w:t>tipo</w:t>
+      </w:r>
+      <w:proofErr w:type="gramEnd"/>
+      <w:r>
+        <w:rPr>
+          <w:rStyle w:val="CdigoHTML"/>
+          <w:rFonts w:eastAsiaTheme="majorEastAsia"/>
+        </w:rPr>
+        <w:t>_registro</w:t>
+      </w:r>
+      <w:proofErr w:type="spellEnd"/>
+      <w:r>
+        <w:t xml:space="preserve"> armazena apenas o tipo do registro clínico. </w:t>
+      </w:r>
+    </w:p>
+    <w:p>
+      <w:pPr>
+        <w:numPr>
+          <w:ilvl w:val="0"/>
+          <w:numId w:val="6"/>
+        </w:numPr>
+        <w:spacing w:before="100" w:beforeAutospacing="1" w:after="100" w:afterAutospacing="1" w:line="240" w:lineRule="auto"/>
+      </w:pPr>
+      <w:proofErr w:type="spellStart"/>
+      <w:proofErr w:type="gramStart"/>
+      <w:r>
+        <w:rPr>
+          <w:rStyle w:val="CdigoHTML"/>
+          <w:rFonts w:eastAsiaTheme="majorEastAsia"/>
+        </w:rPr>
+        <w:t>nivel</w:t>
+      </w:r>
+      <w:proofErr w:type="gramEnd"/>
+      <w:r>
+        <w:rPr>
+          <w:rStyle w:val="CdigoHTML"/>
+          <w:rFonts w:eastAsiaTheme="majorEastAsia"/>
+        </w:rPr>
+        <w:t>_risco</w:t>
+      </w:r>
+      <w:proofErr w:type="spellEnd"/>
+      <w:r>
+        <w:t xml:space="preserve"> armazena apenas o nível de risco. </w:t>
+      </w:r>
+    </w:p>
+    <w:p>
+      <w:pPr>
+        <w:pStyle w:val="NormalWeb"/>
+      </w:pPr>
+      <w:r>
+        <w:t>Não existem colunas com listas, grupos repetidos ou múltiplos valores no mesmo campo.</w:t>
+      </w:r>
+    </w:p>
+    <w:p/>
+    <w:p>
+      <w:pPr>
+        <w:pStyle w:val="Ttulo2"/>
+        <w:numPr>
+          <w:ilvl w:val="0"/>
+          <w:numId w:val="0"/>
+        </w:numPr>
+        <w:ind w:left="576" w:hanging="576"/>
+      </w:pPr>
+      <w:r>
+        <w:t>Segunda Forma Normal — 2FN</w:t>
+      </w:r>
+    </w:p>
+    <w:p>
+      <w:pPr>
+        <w:pStyle w:val="NormalWeb"/>
+      </w:pPr>
+      <w:r>
+        <w:t>O modelo atende à 2FN porque todas as tabelas possuem chave primária simples, e todos os atributos não-chave dependem integralmente da chave primária da própria tabela.</w:t>
+      </w:r>
+    </w:p>
+    <w:p>
+      <w:pPr>
+        <w:pStyle w:val="NormalWeb"/>
+      </w:pPr>
+      <w:r>
+        <w:t>Exemplos:</w:t>
+      </w:r>
+    </w:p>
+    <w:p>
+      <w:pPr>
+        <w:pStyle w:val="NormalWeb"/>
+      </w:pPr>
+      <w:r>
+        <w:t xml:space="preserve">Na tabela </w:t>
+      </w:r>
+      <w:r>
+        <w:rPr>
+          <w:rStyle w:val="CdigoHTML"/>
+          <w:rFonts w:eastAsiaTheme="majorEastAsia"/>
+        </w:rPr>
+        <w:t>T_CLY_USUARIO</w:t>
+      </w:r>
+      <w:r>
+        <w:t xml:space="preserve">, os campos </w:t>
+      </w:r>
+      <w:r>
+        <w:rPr>
+          <w:rStyle w:val="CdigoHTML"/>
+          <w:rFonts w:eastAsiaTheme="majorEastAsia"/>
+        </w:rPr>
+        <w:t>nome</w:t>
+      </w:r>
+      <w:r>
+        <w:t xml:space="preserve">, </w:t>
+      </w:r>
+      <w:proofErr w:type="spellStart"/>
+      <w:r>
+        <w:rPr>
+          <w:rStyle w:val="CdigoHTML"/>
+          <w:rFonts w:eastAsiaTheme="majorEastAsia"/>
+        </w:rPr>
+        <w:t>cpf</w:t>
+      </w:r>
+      <w:proofErr w:type="spellEnd"/>
+      <w:r>
+        <w:t xml:space="preserve">, </w:t>
+      </w:r>
+      <w:proofErr w:type="spellStart"/>
+      <w:r>
+        <w:rPr>
+          <w:rStyle w:val="CdigoHTML"/>
+          <w:rFonts w:eastAsiaTheme="majorEastAsia"/>
+        </w:rPr>
+        <w:t>email</w:t>
+      </w:r>
+      <w:proofErr w:type="spellEnd"/>
+      <w:r>
+        <w:t xml:space="preserve">, </w:t>
+      </w:r>
+      <w:r>
+        <w:rPr>
+          <w:rStyle w:val="CdigoHTML"/>
+          <w:rFonts w:eastAsiaTheme="majorEastAsia"/>
+        </w:rPr>
+        <w:t>telefone</w:t>
+      </w:r>
+      <w:r>
+        <w:t xml:space="preserve"> e </w:t>
+      </w:r>
+      <w:proofErr w:type="spellStart"/>
+      <w:r>
+        <w:rPr>
+          <w:rStyle w:val="CdigoHTML"/>
+          <w:rFonts w:eastAsiaTheme="majorEastAsia"/>
+        </w:rPr>
+        <w:t>endereco</w:t>
+      </w:r>
+      <w:proofErr w:type="spellEnd"/>
+      <w:r>
+        <w:t xml:space="preserve"> dependem diretamente de </w:t>
+      </w:r>
+      <w:proofErr w:type="spellStart"/>
+      <w:r>
+        <w:rPr>
+          <w:rStyle w:val="CdigoHTML"/>
+          <w:rFonts w:eastAsiaTheme="majorEastAsia"/>
+        </w:rPr>
+        <w:t>id_usuario</w:t>
+      </w:r>
+      <w:proofErr w:type="spellEnd"/>
+      <w:r>
         <w:t>.</w:t>
       </w:r>
     </w:p>
     <w:p>
       <w:pPr>
-        <w:rPr>
-          <w:rFonts w:ascii="Times New Roman" w:hAnsi="Times New Roman" w:cs="Times New Roman"/>
-          <w:b/>
-          <w:bCs/>
-        </w:rPr>
-      </w:pPr>
-      <w:r>
-        <w:rPr>
-          <w:rFonts w:ascii="Times New Roman" w:hAnsi="Times New Roman" w:cs="Times New Roman"/>
-          <w:b/>
-          <w:bCs/>
-        </w:rPr>
-        <w:t xml:space="preserve">2.3 Modelagem Lógica (ou </w:t>
+        <w:pStyle w:val="NormalWeb"/>
+      </w:pPr>
+      <w:r>
+        <w:lastRenderedPageBreak/>
+        <w:t xml:space="preserve">Na tabela </w:t>
+      </w:r>
+      <w:r>
+        <w:rPr>
+          <w:rStyle w:val="CdigoHTML"/>
+          <w:rFonts w:eastAsiaTheme="majorEastAsia"/>
+        </w:rPr>
+        <w:t>T_CLY_PET</w:t>
+      </w:r>
+      <w:r>
+        <w:t xml:space="preserve">, os campos </w:t>
+      </w:r>
+      <w:r>
+        <w:rPr>
+          <w:rStyle w:val="CdigoHTML"/>
+          <w:rFonts w:eastAsiaTheme="majorEastAsia"/>
+        </w:rPr>
+        <w:t>nome</w:t>
+      </w:r>
+      <w:r>
+        <w:t xml:space="preserve">, </w:t>
       </w:r>
       <w:proofErr w:type="spellStart"/>
       <w:r>
         <w:rPr>
-          <w:rFonts w:ascii="Times New Roman" w:hAnsi="Times New Roman" w:cs="Times New Roman"/>
-          <w:b/>
-          <w:bCs/>
-        </w:rPr>
-        <w:t>Relational</w:t>
+          <w:rStyle w:val="CdigoHTML"/>
+          <w:rFonts w:eastAsiaTheme="majorEastAsia"/>
+        </w:rPr>
+        <w:t>especie</w:t>
       </w:r>
       <w:proofErr w:type="spellEnd"/>
       <w:r>
-        <w:rPr>
-          <w:rFonts w:ascii="Times New Roman" w:hAnsi="Times New Roman" w:cs="Times New Roman"/>
-          <w:b/>
-          <w:bCs/>
-        </w:rPr>
-        <w:t>)</w:t>
-      </w:r>
-    </w:p>
-    <w:p>
-      <w:pPr>
-        <w:jc w:val="both"/>
-        <w:rPr>
-          <w:rFonts w:ascii="Times New Roman" w:hAnsi="Times New Roman" w:cs="Times New Roman"/>
-        </w:rPr>
-      </w:pPr>
-      <w:r>
-        <w:rPr>
-          <w:rFonts w:ascii="Times New Roman" w:hAnsi="Times New Roman" w:cs="Times New Roman"/>
-        </w:rPr>
-        <w:tab/>
-        <w:t>É a expansão da Modelagem Conceitual, onde a sua representação é um diagrama</w:t>
-      </w:r>
-      <w:r>
-        <w:rPr>
-          <w:rFonts w:ascii="Times New Roman" w:hAnsi="Times New Roman" w:cs="Times New Roman"/>
-        </w:rPr>
-        <w:t xml:space="preserve"> com a definição dos tipos de dados para cada atributo, a definição de chave estrangeiras, primárias </w:t>
-      </w:r>
-      <w:r>
-        <w:rPr>
-          <w:rFonts w:ascii="Times New Roman" w:hAnsi="Times New Roman" w:cs="Times New Roman"/>
-        </w:rPr>
-        <w:t>e a normalização</w:t>
-      </w:r>
-      <w:r>
-        <w:rPr>
-          <w:rFonts w:ascii="Times New Roman" w:hAnsi="Times New Roman" w:cs="Times New Roman"/>
-        </w:rPr>
+        <w:t xml:space="preserve">, </w:t>
+      </w:r>
+      <w:proofErr w:type="spellStart"/>
+      <w:r>
+        <w:rPr>
+          <w:rStyle w:val="CdigoHTML"/>
+          <w:rFonts w:eastAsiaTheme="majorEastAsia"/>
+        </w:rPr>
+        <w:t>raca</w:t>
+      </w:r>
+      <w:proofErr w:type="spellEnd"/>
+      <w:r>
+        <w:t xml:space="preserve">, </w:t>
+      </w:r>
+      <w:r>
+        <w:rPr>
+          <w:rStyle w:val="CdigoHTML"/>
+          <w:rFonts w:eastAsiaTheme="majorEastAsia"/>
+        </w:rPr>
+        <w:t>peso</w:t>
+      </w:r>
+      <w:r>
+        <w:t xml:space="preserve">, </w:t>
+      </w:r>
+      <w:r>
+        <w:rPr>
+          <w:rStyle w:val="CdigoHTML"/>
+          <w:rFonts w:eastAsiaTheme="majorEastAsia"/>
+        </w:rPr>
+        <w:t>sexo</w:t>
+      </w:r>
+      <w:r>
+        <w:t xml:space="preserve">, </w:t>
+      </w:r>
+      <w:r>
+        <w:rPr>
+          <w:rStyle w:val="CdigoHTML"/>
+          <w:rFonts w:eastAsiaTheme="majorEastAsia"/>
+        </w:rPr>
+        <w:t>castrado</w:t>
+      </w:r>
+      <w:r>
+        <w:t xml:space="preserve"> e </w:t>
+      </w:r>
+      <w:r>
+        <w:rPr>
+          <w:rStyle w:val="CdigoHTML"/>
+          <w:rFonts w:eastAsiaTheme="majorEastAsia"/>
+        </w:rPr>
+        <w:t>porte</w:t>
+      </w:r>
+      <w:r>
+        <w:t xml:space="preserve"> dependem diretamente de </w:t>
+      </w:r>
+      <w:proofErr w:type="spellStart"/>
+      <w:r>
+        <w:rPr>
+          <w:rStyle w:val="CdigoHTML"/>
+          <w:rFonts w:eastAsiaTheme="majorEastAsia"/>
+        </w:rPr>
+        <w:t>id_pet</w:t>
+      </w:r>
+      <w:proofErr w:type="spellEnd"/>
+      <w:r>
         <w:t>.</w:t>
       </w:r>
     </w:p>
     <w:p>
       <w:pPr>
-        <w:ind w:firstLine="708"/>
-        <w:jc w:val="both"/>
-        <w:rPr>
-          <w:rFonts w:ascii="Times New Roman" w:hAnsi="Times New Roman" w:cs="Times New Roman"/>
-        </w:rPr>
-      </w:pPr>
-      <w:r>
-        <w:rPr>
-          <w:rFonts w:ascii="Times New Roman" w:hAnsi="Times New Roman" w:cs="Times New Roman"/>
-        </w:rPr>
-        <w:t>Nesse subcapitulo é esperado uma imagem legível e de alta qualidade sobre o M</w:t>
-      </w:r>
-      <w:r>
-        <w:rPr>
-          <w:rFonts w:ascii="Times New Roman" w:hAnsi="Times New Roman" w:cs="Times New Roman"/>
-        </w:rPr>
-        <w:t>odelagem Lógica</w:t>
-      </w:r>
-      <w:r>
-        <w:rPr>
-          <w:rFonts w:ascii="Times New Roman" w:hAnsi="Times New Roman" w:cs="Times New Roman"/>
-        </w:rPr>
-        <w:t xml:space="preserve"> relacionado ao seu </w:t>
-      </w:r>
-      <w:r>
-        <w:rPr>
-          <w:rFonts w:ascii="Times New Roman" w:hAnsi="Times New Roman" w:cs="Times New Roman"/>
-        </w:rPr>
-        <w:t>projeto</w:t>
-      </w:r>
-      <w:r>
-        <w:rPr>
-          <w:rFonts w:ascii="Times New Roman" w:hAnsi="Times New Roman" w:cs="Times New Roman"/>
-        </w:rPr>
+        <w:pStyle w:val="NormalWeb"/>
+      </w:pPr>
+      <w:r>
+        <w:t xml:space="preserve">Na tabela </w:t>
+      </w:r>
+      <w:r>
+        <w:rPr>
+          <w:rStyle w:val="CdigoHTML"/>
+          <w:rFonts w:eastAsiaTheme="majorEastAsia"/>
+        </w:rPr>
+        <w:t>T_CLY_ALERTA_INTELIGENTE</w:t>
+      </w:r>
+      <w:r>
+        <w:t xml:space="preserve">, os campos </w:t>
+      </w:r>
+      <w:proofErr w:type="spellStart"/>
+      <w:r>
+        <w:rPr>
+          <w:rStyle w:val="CdigoHTML"/>
+          <w:rFonts w:eastAsiaTheme="majorEastAsia"/>
+        </w:rPr>
+        <w:t>tipo_alerta</w:t>
+      </w:r>
+      <w:proofErr w:type="spellEnd"/>
+      <w:r>
+        <w:t xml:space="preserve">, </w:t>
+      </w:r>
+      <w:proofErr w:type="spellStart"/>
+      <w:r>
+        <w:rPr>
+          <w:rStyle w:val="CdigoHTML"/>
+          <w:rFonts w:eastAsiaTheme="majorEastAsia"/>
+        </w:rPr>
+        <w:t>nivel_risco</w:t>
+      </w:r>
+      <w:proofErr w:type="spellEnd"/>
+      <w:r>
+        <w:t xml:space="preserve">, </w:t>
+      </w:r>
+      <w:r>
+        <w:rPr>
+          <w:rStyle w:val="CdigoHTML"/>
+          <w:rFonts w:eastAsiaTheme="majorEastAsia"/>
+        </w:rPr>
+        <w:t>mensagem</w:t>
+      </w:r>
+      <w:r>
+        <w:t xml:space="preserve">, </w:t>
+      </w:r>
+      <w:proofErr w:type="spellStart"/>
+      <w:r>
+        <w:rPr>
+          <w:rStyle w:val="CdigoHTML"/>
+          <w:rFonts w:eastAsiaTheme="majorEastAsia"/>
+        </w:rPr>
+        <w:t>recomendacao</w:t>
+      </w:r>
+      <w:proofErr w:type="spellEnd"/>
+      <w:r>
+        <w:t xml:space="preserve">, </w:t>
+      </w:r>
+      <w:proofErr w:type="spellStart"/>
+      <w:r>
+        <w:rPr>
+          <w:rStyle w:val="CdigoHTML"/>
+          <w:rFonts w:eastAsiaTheme="majorEastAsia"/>
+        </w:rPr>
+        <w:t>dt_geracao</w:t>
+      </w:r>
+      <w:proofErr w:type="spellEnd"/>
+      <w:r>
+        <w:t xml:space="preserve"> e </w:t>
+      </w:r>
+      <w:r>
+        <w:rPr>
+          <w:rStyle w:val="CdigoHTML"/>
+          <w:rFonts w:eastAsiaTheme="majorEastAsia"/>
+        </w:rPr>
+        <w:t>status</w:t>
+      </w:r>
+      <w:r>
+        <w:t xml:space="preserve"> dependem diretamente de </w:t>
+      </w:r>
+      <w:proofErr w:type="spellStart"/>
+      <w:r>
+        <w:rPr>
+          <w:rStyle w:val="CdigoHTML"/>
+          <w:rFonts w:eastAsiaTheme="majorEastAsia"/>
+        </w:rPr>
+        <w:t>id_alerta</w:t>
+      </w:r>
+      <w:proofErr w:type="spellEnd"/>
+      <w:r>
         <w:t>.</w:t>
       </w:r>
     </w:p>
     <w:p>
-      <w:pPr>
-        <w:ind w:firstLine="708"/>
-        <w:jc w:val="both"/>
-        <w:rPr>
-          <w:rFonts w:ascii="Times New Roman" w:hAnsi="Times New Roman" w:cs="Times New Roman"/>
-        </w:rPr>
-      </w:pPr>
-      <w:r>
-        <w:rPr>
-          <w:rFonts w:ascii="Times New Roman" w:hAnsi="Times New Roman" w:cs="Times New Roman"/>
-        </w:rPr>
-        <w:t xml:space="preserve">Utilize os softwares de modelagem aplicados na aula, por exemplo, ORACLE DATA MODELER ou </w:t>
+      <w:r>
+        <w:pict w14:anchorId="57E9BB8C">
+          <v:rect id="_x0000_i1025" style="width:0;height:1.5pt" o:hralign="center" o:hrstd="t" o:hr="t" fillcolor="#a0a0a0" stroked="f"/>
+        </w:pict>
+      </w:r>
+    </w:p>
+    <w:p>
+      <w:pPr>
+        <w:pStyle w:val="Ttulo2"/>
+        <w:numPr>
+          <w:ilvl w:val="0"/>
+          <w:numId w:val="0"/>
+        </w:numPr>
+        <w:ind w:left="576" w:hanging="576"/>
+      </w:pPr>
+      <w:r>
+        <w:t xml:space="preserve"> Terceira Forma Normal — 3FN</w:t>
+      </w:r>
+    </w:p>
+    <w:p>
+      <w:pPr>
+        <w:pStyle w:val="NormalWeb"/>
+      </w:pPr>
+      <w:r>
+        <w:t>O modelo atende à 3FN porque não há dependências transitivas relevantes entre os atributos não-chave.</w:t>
+      </w:r>
+    </w:p>
+    <w:p>
+      <w:pPr>
+        <w:pStyle w:val="NormalWeb"/>
+      </w:pPr>
+      <w:r>
+        <w:t>Os dados foram separados por responsabilidade:</w:t>
+      </w:r>
+    </w:p>
+    <w:p>
+      <w:pPr>
+        <w:numPr>
+          <w:ilvl w:val="0"/>
+          <w:numId w:val="7"/>
+        </w:numPr>
+        <w:spacing w:before="100" w:beforeAutospacing="1" w:after="100" w:afterAutospacing="1" w:line="240" w:lineRule="auto"/>
+      </w:pPr>
+      <w:r>
+        <w:t xml:space="preserve">Dados do tutor ficam em </w:t>
+      </w:r>
+      <w:r>
+        <w:rPr>
+          <w:rStyle w:val="CdigoHTML"/>
+          <w:rFonts w:eastAsiaTheme="majorEastAsia"/>
+        </w:rPr>
+        <w:t>T_CLY_USUARIO</w:t>
+      </w:r>
+      <w:r>
+        <w:t xml:space="preserve">. </w:t>
+      </w:r>
+    </w:p>
+    <w:p>
+      <w:pPr>
+        <w:numPr>
+          <w:ilvl w:val="0"/>
+          <w:numId w:val="7"/>
+        </w:numPr>
+        <w:spacing w:before="100" w:beforeAutospacing="1" w:after="100" w:afterAutospacing="1" w:line="240" w:lineRule="auto"/>
+      </w:pPr>
+      <w:r>
+        <w:t xml:space="preserve">Dados do pet ficam em </w:t>
+      </w:r>
+      <w:r>
+        <w:rPr>
+          <w:rStyle w:val="CdigoHTML"/>
+          <w:rFonts w:eastAsiaTheme="majorEastAsia"/>
+        </w:rPr>
+        <w:t>T_CLY_PET</w:t>
+      </w:r>
+      <w:r>
+        <w:t xml:space="preserve">. </w:t>
+      </w:r>
+    </w:p>
+    <w:p>
+      <w:pPr>
+        <w:numPr>
+          <w:ilvl w:val="0"/>
+          <w:numId w:val="7"/>
+        </w:numPr>
+        <w:spacing w:before="100" w:beforeAutospacing="1" w:after="100" w:afterAutospacing="1" w:line="240" w:lineRule="auto"/>
+      </w:pPr>
+      <w:r>
+        <w:t xml:space="preserve">Dados clínicos ficam em </w:t>
+      </w:r>
+      <w:r>
+        <w:rPr>
+          <w:rStyle w:val="CdigoHTML"/>
+          <w:rFonts w:eastAsiaTheme="majorEastAsia"/>
+        </w:rPr>
+        <w:t>T_CLY_HISTORICO_CLINICO</w:t>
+      </w:r>
+      <w:r>
+        <w:t xml:space="preserve">. </w:t>
+      </w:r>
+    </w:p>
+    <w:p>
+      <w:pPr>
+        <w:numPr>
+          <w:ilvl w:val="0"/>
+          <w:numId w:val="7"/>
+        </w:numPr>
+        <w:spacing w:before="100" w:beforeAutospacing="1" w:after="100" w:afterAutospacing="1" w:line="240" w:lineRule="auto"/>
+      </w:pPr>
+      <w:r>
+        <w:t xml:space="preserve">Dados do dispositivo ficam em </w:t>
+      </w:r>
+      <w:r>
+        <w:rPr>
+          <w:rStyle w:val="CdigoHTML"/>
+          <w:rFonts w:eastAsiaTheme="majorEastAsia"/>
+        </w:rPr>
+        <w:t>T_CLY_DISPOSITIVO_IOT</w:t>
+      </w:r>
+      <w:r>
+        <w:t xml:space="preserve">. </w:t>
+      </w:r>
+    </w:p>
+    <w:p>
+      <w:pPr>
+        <w:numPr>
+          <w:ilvl w:val="0"/>
+          <w:numId w:val="7"/>
+        </w:numPr>
+        <w:spacing w:before="100" w:beforeAutospacing="1" w:after="100" w:afterAutospacing="1" w:line="240" w:lineRule="auto"/>
+      </w:pPr>
+      <w:r>
+        <w:t xml:space="preserve">Dados dos alertas ficam em </w:t>
+      </w:r>
+      <w:r>
+        <w:rPr>
+          <w:rStyle w:val="CdigoHTML"/>
+          <w:rFonts w:eastAsiaTheme="majorEastAsia"/>
+        </w:rPr>
+        <w:t>T_CLY_ALERTA_INTELIGENTE</w:t>
+      </w:r>
+      <w:r>
+        <w:t xml:space="preserve">. </w:t>
+      </w:r>
+    </w:p>
+    <w:p>
+      <w:pPr>
+        <w:pStyle w:val="NormalWeb"/>
+      </w:pPr>
+      <w:r>
+        <w:t>As tabelas filhas não repetem dados das tabelas pai. Elas armazenam apenas as chaves estrangeiras necessárias.</w:t>
+      </w:r>
+    </w:p>
+    <w:p>
+      <w:pPr>
+        <w:pStyle w:val="NormalWeb"/>
+      </w:pPr>
+      <w:r>
+        <w:t>Exemplo:</w:t>
+      </w:r>
+    </w:p>
+    <w:p>
+      <w:pPr>
+        <w:pStyle w:val="NormalWeb"/>
+      </w:pPr>
+      <w:r>
+        <w:t xml:space="preserve">A tabela </w:t>
+      </w:r>
+      <w:r>
+        <w:rPr>
+          <w:rStyle w:val="CdigoHTML"/>
+          <w:rFonts w:eastAsiaTheme="majorEastAsia"/>
+        </w:rPr>
+        <w:t>T_CLY_ALERTA_INTELIGENTE</w:t>
+      </w:r>
+      <w:r>
+        <w:t xml:space="preserve"> não repete o nome do pet, o nome do tutor ou o e-mail do tutor. Ela armazena apenas </w:t>
       </w:r>
       <w:proofErr w:type="spellStart"/>
       <w:r>
         <w:rPr>
-          <w:rFonts w:ascii="Times New Roman" w:hAnsi="Times New Roman" w:cs="Times New Roman"/>
-        </w:rPr>
-        <w:t>BrModelo</w:t>
+          <w:rStyle w:val="CdigoHTML"/>
+          <w:rFonts w:eastAsiaTheme="majorEastAsia"/>
+        </w:rPr>
+        <w:t>id_pet</w:t>
       </w:r>
       <w:proofErr w:type="spellEnd"/>
       <w:r>
-        <w:rPr>
-          <w:rFonts w:ascii="Times New Roman" w:hAnsi="Times New Roman" w:cs="Times New Roman"/>
-        </w:rPr>
+        <w:t xml:space="preserve">. Quando essas informações forem necessárias, podem ser obtidas por meio de </w:t>
+      </w:r>
+      <w:r>
+        <w:rPr>
+          <w:rStyle w:val="CdigoHTML"/>
+          <w:rFonts w:eastAsiaTheme="majorEastAsia"/>
+        </w:rPr>
+        <w:t>JOIN</w:t>
+      </w:r>
+      <w:r>
         <w:t>.</w:t>
       </w:r>
     </w:p>
     <w:p>
       <w:pPr>
-        <w:ind w:firstLine="576"/>
-        <w:rPr>
-          <w:rFonts w:ascii="Times New Roman" w:hAnsi="Times New Roman" w:cs="Times New Roman"/>
-        </w:rPr>
-      </w:pPr>
+        <w:pStyle w:val="NormalWeb"/>
+      </w:pPr>
+      <w:r>
+        <w:t xml:space="preserve">Da mesma forma, a tabela </w:t>
+      </w:r>
+      <w:r>
+        <w:rPr>
+          <w:rStyle w:val="CdigoHTML"/>
+          <w:rFonts w:eastAsiaTheme="majorEastAsia"/>
+        </w:rPr>
+        <w:t>T_CLY_HISTORICO_CLINICO</w:t>
+      </w:r>
+      <w:r>
+        <w:t xml:space="preserve"> não repete os dados cadastrais do pet. Ela </w:t>
+      </w:r>
+      <w:proofErr w:type="spellStart"/>
+      <w:r>
+        <w:t>referencia</w:t>
+      </w:r>
+      <w:proofErr w:type="spellEnd"/>
+      <w:r>
+        <w:t xml:space="preserve"> o pet por meio de </w:t>
+      </w:r>
+      <w:proofErr w:type="spellStart"/>
+      <w:r>
+        <w:rPr>
+          <w:rStyle w:val="CdigoHTML"/>
+          <w:rFonts w:eastAsiaTheme="majorEastAsia"/>
+        </w:rPr>
+        <w:t>id_pet</w:t>
+      </w:r>
+      <w:proofErr w:type="spellEnd"/>
+      <w:r>
+        <w:t>.</w:t>
+      </w:r>
+    </w:p>
+    <w:p>
+      <w:pPr>
+        <w:pStyle w:val="NormalWeb"/>
+      </w:pPr>
+      <w:r>
+        <w:t xml:space="preserve">Isso reduz redundância, evita </w:t>
+      </w:r>
+      <w:r>
+        <w:rPr>
+          <w:u w:val="single"/>
+        </w:rPr>
+        <w:t>inconsi</w:t>
+      </w:r>
+      <w:bookmarkStart w:id="5" w:name="_GoBack"/>
+      <w:bookmarkEnd w:id="5"/>
+      <w:r>
+        <w:rPr>
+          <w:u w:val="single"/>
+        </w:rPr>
+        <w:t>stências</w:t>
+      </w:r>
+      <w:r>
+        <w:t xml:space="preserve"> e mantém o modelo organizado.</w:t>
+      </w:r>
     </w:p>
     <w:p>
       <w:pPr>
@@ -2117,6 +3036,155 @@
 <file path=word/numbering.xml><?xml version="1.0" encoding="utf-8"?>
 <w:numbering xmlns:wpc="http://schemas.microsoft.com/office/word/2010/wordprocessingCanvas" xmlns:mc="http://schemas.openxmlformats.org/markup-compatibility/2006" xmlns:o="urn:schemas-microsoft-com:office:office" xmlns:r="http://schemas.openxmlformats.org/officeDocument/2006/relationships" xmlns:m="http://schemas.openxmlformats.org/officeDocument/2006/math" xmlns:v="urn:schemas-microsoft-com:vml" xmlns:wp14="http://schemas.microsoft.com/office/word/2010/wordprocessingDrawing" xmlns:wp="http://schemas.openxmlformats.org/drawingml/2006/wordprocessingDrawing" xmlns:w10="urn:schemas-microsoft-com:office:word" xmlns:w="http://schemas.openxmlformats.org/wordprocessingml/2006/main" xmlns:w14="http://schemas.microsoft.com/office/word/2010/wordml" xmlns:w15="http://schemas.microsoft.com/office/word/2012/wordml" xmlns:wpg="http://schemas.microsoft.com/office/word/2010/wordprocessingGroup" xmlns:wpi="http://schemas.microsoft.com/office/word/2010/wordprocessingInk" xmlns:wne="http://schemas.microsoft.com/office/word/2006/wordml" xmlns:wps="http://schemas.microsoft.com/office/word/2010/wordprocessingShape" mc:Ignorable="w14 w15 wp14">
   <w:abstractNum w:abstractNumId="0" w15:restartNumberingAfterBreak="0">
+    <w:nsid w:val="248A759E"/>
+    <w:multiLevelType w:val="multilevel"/>
+    <w:tmpl w:val="22DA8724"/>
+    <w:lvl w:ilvl="0">
+      <w:start w:val="1"/>
+      <w:numFmt w:val="bullet"/>
+      <w:lvlText w:val=""/>
+      <w:lvlJc w:val="left"/>
+      <w:pPr>
+        <w:tabs>
+          <w:tab w:val="num" w:pos="720"/>
+        </w:tabs>
+        <w:ind w:left="720" w:hanging="360"/>
+      </w:pPr>
+      <w:rPr>
+        <w:rFonts w:ascii="Symbol" w:hAnsi="Symbol" w:hint="default"/>
+        <w:sz w:val="20"/>
+      </w:rPr>
+    </w:lvl>
+    <w:lvl w:ilvl="1" w:tentative="1">
+      <w:start w:val="1"/>
+      <w:numFmt w:val="bullet"/>
+      <w:lvlText w:val="o"/>
+      <w:lvlJc w:val="left"/>
+      <w:pPr>
+        <w:tabs>
+          <w:tab w:val="num" w:pos="1440"/>
+        </w:tabs>
+        <w:ind w:left="1440" w:hanging="360"/>
+      </w:pPr>
+      <w:rPr>
+        <w:rFonts w:ascii="Courier New" w:hAnsi="Courier New" w:hint="default"/>
+        <w:sz w:val="20"/>
+      </w:rPr>
+    </w:lvl>
+    <w:lvl w:ilvl="2" w:tentative="1">
+      <w:start w:val="1"/>
+      <w:numFmt w:val="bullet"/>
+      <w:lvlText w:val=""/>
+      <w:lvlJc w:val="left"/>
+      <w:pPr>
+        <w:tabs>
+          <w:tab w:val="num" w:pos="2160"/>
+        </w:tabs>
+        <w:ind w:left="2160" w:hanging="360"/>
+      </w:pPr>
+      <w:rPr>
+        <w:rFonts w:ascii="Wingdings" w:hAnsi="Wingdings" w:hint="default"/>
+        <w:sz w:val="20"/>
+      </w:rPr>
+    </w:lvl>
+    <w:lvl w:ilvl="3" w:tentative="1">
+      <w:start w:val="1"/>
+      <w:numFmt w:val="bullet"/>
+      <w:lvlText w:val=""/>
+      <w:lvlJc w:val="left"/>
+      <w:pPr>
+        <w:tabs>
+          <w:tab w:val="num" w:pos="2880"/>
+        </w:tabs>
+        <w:ind w:left="2880" w:hanging="360"/>
+      </w:pPr>
+      <w:rPr>
+        <w:rFonts w:ascii="Wingdings" w:hAnsi="Wingdings" w:hint="default"/>
+        <w:sz w:val="20"/>
+      </w:rPr>
+    </w:lvl>
+    <w:lvl w:ilvl="4" w:tentative="1">
+      <w:start w:val="1"/>
+      <w:numFmt w:val="bullet"/>
+      <w:lvlText w:val=""/>
+      <w:lvlJc w:val="left"/>
+      <w:pPr>
+        <w:tabs>
+          <w:tab w:val="num" w:pos="3600"/>
+        </w:tabs>
+        <w:ind w:left="3600" w:hanging="360"/>
+      </w:pPr>
+      <w:rPr>
+        <w:rFonts w:ascii="Wingdings" w:hAnsi="Wingdings" w:hint="default"/>
+        <w:sz w:val="20"/>
+      </w:rPr>
+    </w:lvl>
+    <w:lvl w:ilvl="5" w:tentative="1">
+      <w:start w:val="1"/>
+      <w:numFmt w:val="bullet"/>
+      <w:lvlText w:val=""/>
+      <w:lvlJc w:val="left"/>
+      <w:pPr>
+        <w:tabs>
+          <w:tab w:val="num" w:pos="4320"/>
+        </w:tabs>
+        <w:ind w:left="4320" w:hanging="360"/>
+      </w:pPr>
+      <w:rPr>
+        <w:rFonts w:ascii="Wingdings" w:hAnsi="Wingdings" w:hint="default"/>
+        <w:sz w:val="20"/>
+      </w:rPr>
+    </w:lvl>
+    <w:lvl w:ilvl="6" w:tentative="1">
+      <w:start w:val="1"/>
+      <w:numFmt w:val="bullet"/>
+      <w:lvlText w:val=""/>
+      <w:lvlJc w:val="left"/>
+      <w:pPr>
+        <w:tabs>
+          <w:tab w:val="num" w:pos="5040"/>
+        </w:tabs>
+        <w:ind w:left="5040" w:hanging="360"/>
+      </w:pPr>
+      <w:rPr>
+        <w:rFonts w:ascii="Wingdings" w:hAnsi="Wingdings" w:hint="default"/>
+        <w:sz w:val="20"/>
+      </w:rPr>
+    </w:lvl>
+    <w:lvl w:ilvl="7" w:tentative="1">
+      <w:start w:val="1"/>
+      <w:numFmt w:val="bullet"/>
+      <w:lvlText w:val=""/>
+      <w:lvlJc w:val="left"/>
+      <w:pPr>
+        <w:tabs>
+          <w:tab w:val="num" w:pos="5760"/>
+        </w:tabs>
+        <w:ind w:left="5760" w:hanging="360"/>
+      </w:pPr>
+      <w:rPr>
+        <w:rFonts w:ascii="Wingdings" w:hAnsi="Wingdings" w:hint="default"/>
+        <w:sz w:val="20"/>
+      </w:rPr>
+    </w:lvl>
+    <w:lvl w:ilvl="8" w:tentative="1">
+      <w:start w:val="1"/>
+      <w:numFmt w:val="bullet"/>
+      <w:lvlText w:val=""/>
+      <w:lvlJc w:val="left"/>
+      <w:pPr>
+        <w:tabs>
+          <w:tab w:val="num" w:pos="6480"/>
+        </w:tabs>
+        <w:ind w:left="6480" w:hanging="360"/>
+      </w:pPr>
+      <w:rPr>
+        <w:rFonts w:ascii="Wingdings" w:hAnsi="Wingdings" w:hint="default"/>
+        <w:sz w:val="20"/>
+      </w:rPr>
+    </w:lvl>
+  </w:abstractNum>
+  <w:abstractNum w:abstractNumId="1" w15:restartNumberingAfterBreak="0">
     <w:nsid w:val="673D5367"/>
     <w:multiLevelType w:val="multilevel"/>
     <w:tmpl w:val="04160025"/>
@@ -2211,20 +3279,175 @@
       </w:pPr>
     </w:lvl>
   </w:abstractNum>
+  <w:abstractNum w:abstractNumId="2" w15:restartNumberingAfterBreak="0">
+    <w:nsid w:val="7CF92811"/>
+    <w:multiLevelType w:val="multilevel"/>
+    <w:tmpl w:val="7F8A68BE"/>
+    <w:lvl w:ilvl="0">
+      <w:start w:val="1"/>
+      <w:numFmt w:val="bullet"/>
+      <w:lvlText w:val=""/>
+      <w:lvlJc w:val="left"/>
+      <w:pPr>
+        <w:tabs>
+          <w:tab w:val="num" w:pos="720"/>
+        </w:tabs>
+        <w:ind w:left="720" w:hanging="360"/>
+      </w:pPr>
+      <w:rPr>
+        <w:rFonts w:ascii="Symbol" w:hAnsi="Symbol" w:hint="default"/>
+        <w:sz w:val="20"/>
+      </w:rPr>
+    </w:lvl>
+    <w:lvl w:ilvl="1" w:tentative="1">
+      <w:start w:val="1"/>
+      <w:numFmt w:val="bullet"/>
+      <w:lvlText w:val="o"/>
+      <w:lvlJc w:val="left"/>
+      <w:pPr>
+        <w:tabs>
+          <w:tab w:val="num" w:pos="1440"/>
+        </w:tabs>
+        <w:ind w:left="1440" w:hanging="360"/>
+      </w:pPr>
+      <w:rPr>
+        <w:rFonts w:ascii="Courier New" w:hAnsi="Courier New" w:hint="default"/>
+        <w:sz w:val="20"/>
+      </w:rPr>
+    </w:lvl>
+    <w:lvl w:ilvl="2" w:tentative="1">
+      <w:start w:val="1"/>
+      <w:numFmt w:val="bullet"/>
+      <w:lvlText w:val=""/>
+      <w:lvlJc w:val="left"/>
+      <w:pPr>
+        <w:tabs>
+          <w:tab w:val="num" w:pos="2160"/>
+        </w:tabs>
+        <w:ind w:left="2160" w:hanging="360"/>
+      </w:pPr>
+      <w:rPr>
+        <w:rFonts w:ascii="Wingdings" w:hAnsi="Wingdings" w:hint="default"/>
+        <w:sz w:val="20"/>
+      </w:rPr>
+    </w:lvl>
+    <w:lvl w:ilvl="3" w:tentative="1">
+      <w:start w:val="1"/>
+      <w:numFmt w:val="bullet"/>
+      <w:lvlText w:val=""/>
+      <w:lvlJc w:val="left"/>
+      <w:pPr>
+        <w:tabs>
+          <w:tab w:val="num" w:pos="2880"/>
+        </w:tabs>
+        <w:ind w:left="2880" w:hanging="360"/>
+      </w:pPr>
+      <w:rPr>
+        <w:rFonts w:ascii="Wingdings" w:hAnsi="Wingdings" w:hint="default"/>
+        <w:sz w:val="20"/>
+      </w:rPr>
+    </w:lvl>
+    <w:lvl w:ilvl="4" w:tentative="1">
+      <w:start w:val="1"/>
+      <w:numFmt w:val="bullet"/>
+      <w:lvlText w:val=""/>
+      <w:lvlJc w:val="left"/>
+      <w:pPr>
+        <w:tabs>
+          <w:tab w:val="num" w:pos="3600"/>
+        </w:tabs>
+        <w:ind w:left="3600" w:hanging="360"/>
+      </w:pPr>
+      <w:rPr>
+        <w:rFonts w:ascii="Wingdings" w:hAnsi="Wingdings" w:hint="default"/>
+        <w:sz w:val="20"/>
+      </w:rPr>
+    </w:lvl>
+    <w:lvl w:ilvl="5" w:tentative="1">
+      <w:start w:val="1"/>
+      <w:numFmt w:val="bullet"/>
+      <w:lvlText w:val=""/>
+      <w:lvlJc w:val="left"/>
+      <w:pPr>
+        <w:tabs>
+          <w:tab w:val="num" w:pos="4320"/>
+        </w:tabs>
+        <w:ind w:left="4320" w:hanging="360"/>
+      </w:pPr>
+      <w:rPr>
+        <w:rFonts w:ascii="Wingdings" w:hAnsi="Wingdings" w:hint="default"/>
+        <w:sz w:val="20"/>
+      </w:rPr>
+    </w:lvl>
+    <w:lvl w:ilvl="6" w:tentative="1">
+      <w:start w:val="1"/>
+      <w:numFmt w:val="bullet"/>
+      <w:lvlText w:val=""/>
+      <w:lvlJc w:val="left"/>
+      <w:pPr>
+        <w:tabs>
+          <w:tab w:val="num" w:pos="5040"/>
+        </w:tabs>
+        <w:ind w:left="5040" w:hanging="360"/>
+      </w:pPr>
+      <w:rPr>
+        <w:rFonts w:ascii="Wingdings" w:hAnsi="Wingdings" w:hint="default"/>
+        <w:sz w:val="20"/>
+      </w:rPr>
+    </w:lvl>
+    <w:lvl w:ilvl="7" w:tentative="1">
+      <w:start w:val="1"/>
+      <w:numFmt w:val="bullet"/>
+      <w:lvlText w:val=""/>
+      <w:lvlJc w:val="left"/>
+      <w:pPr>
+        <w:tabs>
+          <w:tab w:val="num" w:pos="5760"/>
+        </w:tabs>
+        <w:ind w:left="5760" w:hanging="360"/>
+      </w:pPr>
+      <w:rPr>
+        <w:rFonts w:ascii="Wingdings" w:hAnsi="Wingdings" w:hint="default"/>
+        <w:sz w:val="20"/>
+      </w:rPr>
+    </w:lvl>
+    <w:lvl w:ilvl="8" w:tentative="1">
+      <w:start w:val="1"/>
+      <w:numFmt w:val="bullet"/>
+      <w:lvlText w:val=""/>
+      <w:lvlJc w:val="left"/>
+      <w:pPr>
+        <w:tabs>
+          <w:tab w:val="num" w:pos="6480"/>
+        </w:tabs>
+        <w:ind w:left="6480" w:hanging="360"/>
+      </w:pPr>
+      <w:rPr>
+        <w:rFonts w:ascii="Wingdings" w:hAnsi="Wingdings" w:hint="default"/>
+        <w:sz w:val="20"/>
+      </w:rPr>
+    </w:lvl>
+  </w:abstractNum>
   <w:num w:numId="1">
+    <w:abstractNumId w:val="1"/>
+  </w:num>
+  <w:num w:numId="2">
+    <w:abstractNumId w:val="1"/>
+  </w:num>
+  <w:num w:numId="3">
+    <w:abstractNumId w:val="1"/>
+  </w:num>
+  <w:num w:numId="4">
+    <w:abstractNumId w:val="1"/>
+  </w:num>
+  <w:num w:numId="5">
+    <w:abstractNumId w:val="1"/>
+  </w:num>
+  <w:num w:numId="6">
     <w:abstractNumId w:val="0"/>
   </w:num>
-  <w:num w:numId="2">
-    <w:abstractNumId w:val="0"/>
-  </w:num>
-  <w:num w:numId="3">
-    <w:abstractNumId w:val="0"/>
-  </w:num>
-  <w:num w:numId="4">
-    <w:abstractNumId w:val="0"/>
-  </w:num>
-  <w:num w:numId="5">
-    <w:abstractNumId w:val="0"/>
+  <w:num w:numId="7">
+    <w:abstractNumId w:val="2"/>
   </w:num>
 </w:numbering>
 </file>
@@ -3254,6 +4477,30 @@
       <w14:ligatures w14:val="none"/>
     </w:rPr>
   </w:style>
+  <w:style w:type="character" w:styleId="Forte">
+    <w:name w:val="Strong"/>
+    <w:basedOn w:val="Fontepargpadro"/>
+    <w:uiPriority w:val="22"/>
+    <w:qFormat/>
+    <w:rsid w:val="005D1E40"/>
+    <w:rPr>
+      <w:b/>
+      <w:bCs/>
+    </w:rPr>
+  </w:style>
+  <w:style w:type="character" w:styleId="CdigoHTML">
+    <w:name w:val="HTML Code"/>
+    <w:basedOn w:val="Fontepargpadro"/>
+    <w:uiPriority w:val="99"/>
+    <w:semiHidden/>
+    <w:unhideWhenUsed/>
+    <w:rsid w:val="005D1E40"/>
+    <w:rPr>
+      <w:rFonts w:ascii="Courier New" w:eastAsia="Times New Roman" w:hAnsi="Courier New" w:cs="Courier New"/>
+      <w:sz w:val="20"/>
+      <w:szCs w:val="20"/>
+    </w:rPr>
+  </w:style>
 </w:styles>
 </file>
 
@@ -3557,7 +4804,7 @@
 </file>
 
 <file path=customXml/itemProps1.xml><?xml version="1.0" encoding="utf-8"?>
-<ds:datastoreItem xmlns:ds="http://schemas.openxmlformats.org/officeDocument/2006/customXml" ds:itemID="{704C4478-8C7D-4043-90B1-102796768E55}">
+<ds:datastoreItem xmlns:ds="http://schemas.openxmlformats.org/officeDocument/2006/customXml" ds:itemID="{87C8E972-4C44-46B0-B6AD-C94E884B8732}">
   <ds:schemaRefs>
     <ds:schemaRef ds:uri="http://schemas.openxmlformats.org/officeDocument/2006/bibliography"/>
   </ds:schemaRefs>

</xml_diff>